<commit_message>
Genericize persona company to Contoso Investment Bank Berhad
Replace all narrative Kenanga / KIBB references with Contoso across the
site, the README, and the regenerated data files. File names retained
(01_KIBB_*.xlsx etc.) since they are committed assets. Site title and
sidebar branding now read 'Contoso Investment Bank Berhad'.

Co-authored-by: Copilot <223556219+Copilot@users.noreply.github.com>
</commit_message>
<xml_diff>
--- a/files/02_KIBB_VendorContract.docx
+++ b/files/02_KIBB_VendorContract.docx
@@ -35,7 +35,7 @@
         <w:rPr>
           <w:sz w:val="22"/>
         </w:rPr>
-        <w:t>Level 17, Kenanga Tower, 237 Jalan Tun Razak, 50400 Kuala Lumpur, Malaysia</w:t>
+        <w:t>Level 17, Contoso Tower, 237 Jalan Tun Razak, 50400 Kuala Lumpur, Malaysia</w:t>
       </w:r>
     </w:p>
     <w:p>
@@ -44,7 +44,7 @@
           <w:i/>
           <w:sz w:val="22"/>
         </w:rPr>
-        <w:t>("the Bank" or "KIBB")</w:t>
+        <w:t>("the Bank" or "Contoso")</w:t>
       </w:r>
     </w:p>
     <w:p>
@@ -274,7 +274,7 @@
           <w:color w:val="64748B"/>
           <w:sz w:val="22"/>
         </w:rPr>
-        <w:t>[KIBB Group Outsourcing Policy §4.3 caps annual price escalation at 3.0% or CPI, whichever is lower. The 7% rate breaches policy.]</w:t>
+        <w:t>[Contoso Group Outsourcing Policy §4.3 caps annual price escalation at 3.0% or CPI, whichever is lower. The 7% rate breaches policy.]</w:t>
       </w:r>
     </w:p>
     <w:p>
@@ -303,7 +303,7 @@
           <w:color w:val="64748B"/>
           <w:sz w:val="22"/>
         </w:rPr>
-        <w:t>[KIBB Group Outsourcing Policy §6.2 mandates a minimum 90-day non-renewal notice period for material outsourcing arrangements. 45 days breaches policy and gives the Bank insufficient time to run a replacement RFP under BNM exit-strategy expectations.]</w:t>
+        <w:t>[Contoso Group Outsourcing Policy §6.2 mandates a minimum 90-day non-renewal notice period for material outsourcing arrangements. 45 days breaches policy and gives the Bank insufficient time to run a replacement RFP under BNM exit-strategy expectations.]</w:t>
       </w:r>
     </w:p>
     <w:p>
@@ -356,7 +356,7 @@
           <w:color w:val="64748B"/>
           <w:sz w:val="22"/>
         </w:rPr>
-        <w:t>[KIBB Group Outsourcing Policy §7.1 requires that all Customer Data and any data derived from Customer Data remain the property of the Bank, with the service provider granted only a limited licence to process the data for the purpose of delivering the Services. This clause inverts that position and creates a material data-ownership and customer-confidentiality risk under BNM Outsourcing Policy and PDPA 2010.]</w:t>
+        <w:t>[Contoso Group Outsourcing Policy §7.1 requires that all Customer Data and any data derived from Customer Data remain the property of the Bank, with the service provider granted only a limited licence to process the data for the purpose of delivering the Services. This clause inverts that position and creates a material data-ownership and customer-confidentiality risk under BNM Outsourcing Policy and PDPA 2010.]</w:t>
       </w:r>
     </w:p>
     <w:p>
@@ -375,7 +375,7 @@
           <w:color w:val="64748B"/>
           <w:sz w:val="22"/>
         </w:rPr>
-        <w:t>[BNM Outsourcing Policy requires prior written consent from BNM for any cross-border outsourcing of material activities, and KIBB Group Outsourcing Policy §7.4 requires Customer Data of Malaysian customers to be hosted within Malaysia by default. Sole discretion to relocate, with only 30 days' notice, breaches both.]</w:t>
+        <w:t>[BNM Outsourcing Policy requires prior written consent from BNM for any cross-border outsourcing of material activities, and Contoso Group Outsourcing Policy §7.4 requires Customer Data of Malaysian customers to be hosted within Malaysia by default. Sole discretion to relocate, with only 30 days' notice, breaches both.]</w:t>
       </w:r>
     </w:p>
     <w:p>
@@ -404,7 +404,7 @@
           <w:color w:val="64748B"/>
           <w:sz w:val="22"/>
         </w:rPr>
-        <w:t>[BNM Outsourcing Policy and KIBB Group Outsourcing Policy §8 require: (a) right of access at any time without prior notice in the event of suspected fraud, regulatory investigation, or critical incident; (b) explicit right of access for BNM and any other Malaysian regulator; (c) audit support to be provided at no cost. This clause fails on all three.]</w:t>
+        <w:t>[BNM Outsourcing Policy and Contoso Group Outsourcing Policy §8 require: (a) right of access at any time without prior notice in the event of suspected fraud, regulatory investigation, or critical incident; (b) explicit right of access for BNM and any other Malaysian regulator; (c) audit support to be provided at no cost. This clause fails on all three.]</w:t>
       </w:r>
     </w:p>
     <w:p>
@@ -441,7 +441,7 @@
           <w:color w:val="64748B"/>
           <w:sz w:val="22"/>
         </w:rPr>
-        <w:t>[KIBB Group Outsourcing Policy §9.1 requires a minimum 99.9% availability for front-office trading and market-data services during market hours, with credit remedies for any breach. 99.5% allows up to ~22 minutes of outage per trading day.]</w:t>
+        <w:t>[Contoso Group Outsourcing Policy §9.1 requires a minimum 99.9% availability for front-office trading and market-data services during market hours, with credit remedies for any breach. 99.5% allows up to ~22 minutes of outage per trading day.]</w:t>
       </w:r>
     </w:p>
     <w:p>
@@ -460,7 +460,7 @@
           <w:color w:val="64748B"/>
           <w:sz w:val="22"/>
         </w:rPr>
-        <w:t>[KIBB Group Outsourcing Policy §9.2 requires a maximum RTO of 2 hours for front-office and 4 hours for back-office systems classified as material outsourcing under BNM. 24 hours is materially below regulatory expectation.]</w:t>
+        <w:t>[Contoso Group Outsourcing Policy §9.2 requires a maximum RTO of 2 hours for front-office and 4 hours for back-office systems classified as material outsourcing under BNM. 24 hours is materially below regulatory expectation.]</w:t>
       </w:r>
     </w:p>
     <w:p>
@@ -489,7 +489,7 @@
           <w:color w:val="64748B"/>
           <w:sz w:val="22"/>
         </w:rPr>
-        <w:t>[KIBB Group Outsourcing Policy §10.1 requires a minimum liability cap of 12 months of fees (~RM 2.88m) for material outsourcing, with uncapped liability for breach of data confidentiality obligations and gross negligence. This clause caps everything at 6 months and contains no carve-out.]</w:t>
+        <w:t>[Contoso Group Outsourcing Policy §10.1 requires a minimum liability cap of 12 months of fees (~RM 2.88m) for material outsourcing, with uncapped liability for breach of data confidentiality obligations and gross negligence. This clause caps everything at 6 months and contains no carve-out.]</w:t>
       </w:r>
     </w:p>
     <w:p>
@@ -508,7 +508,7 @@
           <w:color w:val="64748B"/>
           <w:sz w:val="22"/>
         </w:rPr>
-        <w:t>[The express exclusion of "loss of customer data" is unenforceable and unacceptable for a regulated bank. KIBB Group Outsourcing Policy §10.2 requires uncapped liability for any breach of data confidentiality, customer data loss, or PDPA contravention.]</w:t>
+        <w:t>[The express exclusion of "loss of customer data" is unenforceable and unacceptable for a regulated bank. Contoso Group Outsourcing Policy §10.2 requires uncapped liability for any breach of data confidentiality, customer data loss, or PDPA contravention.]</w:t>
       </w:r>
     </w:p>
     <w:p>
@@ -545,7 +545,7 @@
           <w:color w:val="64748B"/>
           <w:sz w:val="22"/>
         </w:rPr>
-        <w:t>[KIBB Group Outsourcing Policy §11 and PDPA 2010 require confidentiality obligations for customer data to survive termination indefinitely. A 3-year limit on customer data confidentiality is non-compliant.]</w:t>
+        <w:t>[Contoso Group Outsourcing Policy §11 and PDPA 2010 require confidentiality obligations for customer data to survive termination indefinitely. A 3-year limit on customer data confidentiality is non-compliant.]</w:t>
       </w:r>
     </w:p>
     <w:p>

</xml_diff>

<commit_message>
Fix data realism: remove brand leaks, tie BRC numbers to workbook, reframe as FY2025 year-end
- Vendor contract: replace 2 KENANGA INVESTMENT BANK BERHAD references and Kenanga company numbers with Contoso fictionals
- BRC transcript: drop Subramaniam surname (persona is first-name only), replace KDi GO and Rakuten product names with generics, tighten revenue/cost variance numbers (5.6% / 12.9%) to match workbook, reflect AWM as red (not amber) given 11.5% breach
- Workbook: relabel FY2026 -> FY2025 (Final Audited) so 12 months of Jan-Dec data is internally consistent with the 27 March 2026 BRC review timing
- index.html: reframe Q1 BRC narrative to FY2025 year-end where required, switch Analyst Agent prompt to use cost-vs-budget data the workbook actually contains

Co-authored-by: Copilot <223556219+Copilot@users.noreply.github.com>
</commit_message>
<xml_diff>
--- a/files/02_KIBB_VendorContract.docx
+++ b/files/02_KIBB_VendorContract.docx
@@ -27,7 +27,7 @@
           <w:b/>
           <w:sz w:val="22"/>
         </w:rPr>
-        <w:t>KENANGA INVESTMENT BANK BERHAD (Company No. 197301002193 (15678-H))</w:t>
+        <w:t>CONTOSO INVESTMENT BANK BERHAD (Company No. 200001234567 (88899-A))</w:t>
       </w:r>
     </w:p>
     <w:p>
@@ -605,7 +605,7 @@
           <w:b/>
           <w:sz w:val="22"/>
         </w:rPr>
-        <w:t>Signed for and on behalf of KENANGA INVESTMENT BANK BERHAD</w:t>
+        <w:t>Signed for and on behalf of CONTOSO INVESTMENT BANK BERHAD</w:t>
       </w:r>
     </w:p>
     <w:p>

</xml_diff>